<commit_message>
Change quotation colour theme to teal
Co-Authored-By: Claude Sonnet 5.5 <noreply@anthropic.com>
Claude-Session: https://claude.ai/code/session_01Rw4KBUoxVLGHjReYjTw3C5
</commit_message>
<xml_diff>
--- a/quotation/Quotation_Khojo_Right_Now_Manjari_Foundation.docx
+++ b/quotation/Quotation_Khojo_Right_Now_Manjari_Foundation.docx
@@ -10,7 +10,7 @@
       <w:r>
         <w:rPr>
           <w:b/>
-          <w:color w:val="1F3864"/>
+          <w:color w:val="0F6B63"/>
           <w:sz w:val="34"/>
         </w:rPr>
         <w:t>KHOJO RIGHT NOW PRIVATE LIMITED</w:t>
@@ -72,7 +72,7 @@
       <w:pPr>
         <w:spacing w:after="120"/>
         <w:pBdr>
-          <w:bottom w:val="single" w:sz="18" w:color="1F3864" w:space="1"/>
+          <w:bottom w:val="single" w:sz="18" w:color="0F6B63" w:space="1"/>
         </w:pBdr>
       </w:pPr>
       <w:r>
@@ -89,7 +89,7 @@
       <w:r>
         <w:rPr>
           <w:b/>
-          <w:color w:val="1F3864"/>
+          <w:color w:val="0F6B63"/>
           <w:sz w:val="32"/>
         </w:rPr>
         <w:t>QUOTATION</w:t>
@@ -113,12 +113,12 @@
         <w:tblW w:type="auto" w:w="0"/>
         <w:tblLook w:firstColumn="1" w:firstRow="1" w:lastColumn="0" w:lastRow="0" w:noHBand="0" w:noVBand="1" w:val="04A0"/>
         <w:tblBorders>
-          <w:top w:val="single" w:sz="4" w:color="9AA5B8"/>
-          <w:left w:val="single" w:sz="4" w:color="9AA5B8"/>
-          <w:bottom w:val="single" w:sz="4" w:color="9AA5B8"/>
-          <w:right w:val="single" w:sz="4" w:color="9AA5B8"/>
-          <w:insideH w:val="single" w:sz="4" w:color="9AA5B8"/>
-          <w:insideV w:val="single" w:sz="4" w:color="9AA5B8"/>
+          <w:top w:val="single" w:sz="4" w:color="8FB3AE"/>
+          <w:left w:val="single" w:sz="4" w:color="8FB3AE"/>
+          <w:bottom w:val="single" w:sz="4" w:color="8FB3AE"/>
+          <w:right w:val="single" w:sz="4" w:color="8FB3AE"/>
+          <w:insideH w:val="single" w:sz="4" w:color="8FB3AE"/>
+          <w:insideV w:val="single" w:sz="4" w:color="8FB3AE"/>
         </w:tblBorders>
         <w:tblLayout w:type="fixed"/>
         <w:tblCellMar>
@@ -142,7 +142,7 @@
         <w:tc>
           <w:tcPr>
             <w:tcW w:type="dxa" w:w="1814"/>
-            <w:shd w:val="clear" w:color="auto" w:fill="E8EDF5"/>
+            <w:shd w:val="clear" w:color="auto" w:fill="E3F1EF"/>
           </w:tcPr>
           <w:p>
             <w:pPr>
@@ -151,7 +151,7 @@
             <w:r>
               <w:rPr>
                 <w:b/>
-                <w:color w:val="1F3864"/>
+                <w:color w:val="0F6B63"/>
               </w:rPr>
               <w:t>Quotation No.</w:t>
             </w:r>
@@ -176,7 +176,7 @@
         <w:tc>
           <w:tcPr>
             <w:tcW w:type="dxa" w:w="1814"/>
-            <w:shd w:val="clear" w:color="auto" w:fill="E8EDF5"/>
+            <w:shd w:val="clear" w:color="auto" w:fill="E3F1EF"/>
           </w:tcPr>
           <w:p>
             <w:pPr>
@@ -185,7 +185,7 @@
             <w:r>
               <w:rPr>
                 <w:b/>
-                <w:color w:val="1F3864"/>
+                <w:color w:val="0F6B63"/>
               </w:rPr>
               <w:t>Quotation Date</w:t>
             </w:r>
@@ -215,7 +215,7 @@
         <w:tc>
           <w:tcPr>
             <w:tcW w:type="dxa" w:w="1814"/>
-            <w:shd w:val="clear" w:color="auto" w:fill="E8EDF5"/>
+            <w:shd w:val="clear" w:color="auto" w:fill="E3F1EF"/>
           </w:tcPr>
           <w:p>
             <w:pPr>
@@ -224,7 +224,7 @@
             <w:r>
               <w:rPr>
                 <w:b/>
-                <w:color w:val="1F3864"/>
+                <w:color w:val="0F6B63"/>
               </w:rPr>
               <w:t>Valid Until</w:t>
             </w:r>
@@ -249,7 +249,7 @@
         <w:tc>
           <w:tcPr>
             <w:tcW w:type="dxa" w:w="1814"/>
-            <w:shd w:val="clear" w:color="auto" w:fill="E8EDF5"/>
+            <w:shd w:val="clear" w:color="auto" w:fill="E3F1EF"/>
           </w:tcPr>
           <w:p>
             <w:pPr>
@@ -258,7 +258,7 @@
             <w:r>
               <w:rPr>
                 <w:b/>
-                <w:color w:val="1F3864"/>
+                <w:color w:val="0F6B63"/>
               </w:rPr>
               <w:t>Place of Supply</w:t>
             </w:r>
@@ -288,7 +288,7 @@
         <w:tc>
           <w:tcPr>
             <w:tcW w:type="dxa" w:w="1814"/>
-            <w:shd w:val="clear" w:color="auto" w:fill="E8EDF5"/>
+            <w:shd w:val="clear" w:color="auto" w:fill="E3F1EF"/>
           </w:tcPr>
           <w:p>
             <w:pPr>
@@ -297,7 +297,7 @@
             <w:r>
               <w:rPr>
                 <w:b/>
-                <w:color w:val="1F3864"/>
+                <w:color w:val="0F6B63"/>
               </w:rPr>
               <w:t>Quoted To</w:t>
             </w:r>
@@ -329,13 +329,13 @@
         <w:keepNext/>
         <w:spacing w:after="80" w:before="200"/>
         <w:pBdr>
-          <w:bottom w:val="single" w:sz="6" w:color="1F3864" w:space="1"/>
+          <w:bottom w:val="single" w:sz="6" w:color="0F6B63" w:space="1"/>
         </w:pBdr>
       </w:pPr>
       <w:r>
         <w:rPr>
           <w:b/>
-          <w:color w:val="1F3864"/>
+          <w:color w:val="0F6B63"/>
           <w:sz w:val="22"/>
         </w:rPr>
         <w:t>1. SCOPE OF SERVICES</w:t>
@@ -409,13 +409,13 @@
         <w:keepNext/>
         <w:spacing w:after="80" w:before="200"/>
         <w:pBdr>
-          <w:bottom w:val="single" w:sz="6" w:color="1F3864" w:space="1"/>
+          <w:bottom w:val="single" w:sz="6" w:color="0F6B63" w:space="1"/>
         </w:pBdr>
       </w:pPr>
       <w:r>
         <w:rPr>
           <w:b/>
-          <w:color w:val="1F3864"/>
+          <w:color w:val="0F6B63"/>
           <w:sz w:val="22"/>
         </w:rPr>
         <w:t>2. COMMERCIAL SUMMARY</w:t>
@@ -426,12 +426,12 @@
         <w:tblW w:type="auto" w:w="0"/>
         <w:tblLook w:firstColumn="1" w:firstRow="1" w:lastColumn="0" w:lastRow="0" w:noHBand="0" w:noVBand="1" w:val="04A0"/>
         <w:tblBorders>
-          <w:top w:val="single" w:sz="4" w:color="9AA5B8"/>
-          <w:left w:val="single" w:sz="4" w:color="9AA5B8"/>
-          <w:bottom w:val="single" w:sz="4" w:color="9AA5B8"/>
-          <w:right w:val="single" w:sz="4" w:color="9AA5B8"/>
-          <w:insideH w:val="single" w:sz="4" w:color="9AA5B8"/>
-          <w:insideV w:val="single" w:sz="4" w:color="9AA5B8"/>
+          <w:top w:val="single" w:sz="4" w:color="8FB3AE"/>
+          <w:left w:val="single" w:sz="4" w:color="8FB3AE"/>
+          <w:bottom w:val="single" w:sz="4" w:color="8FB3AE"/>
+          <w:right w:val="single" w:sz="4" w:color="8FB3AE"/>
+          <w:insideH w:val="single" w:sz="4" w:color="8FB3AE"/>
+          <w:insideV w:val="single" w:sz="4" w:color="8FB3AE"/>
         </w:tblBorders>
         <w:tblLayout w:type="fixed"/>
         <w:tblCellMar>
@@ -455,7 +455,7 @@
         <w:tc>
           <w:tcPr>
             <w:tcW w:type="dxa" w:w="794"/>
-            <w:shd w:val="clear" w:color="auto" w:fill="1F3864"/>
+            <w:shd w:val="clear" w:color="auto" w:fill="0F6B63"/>
           </w:tcPr>
           <w:p>
             <w:pPr>
@@ -474,7 +474,7 @@
         <w:tc>
           <w:tcPr>
             <w:tcW w:type="dxa" w:w="6293"/>
-            <w:shd w:val="clear" w:color="auto" w:fill="1F3864"/>
+            <w:shd w:val="clear" w:color="auto" w:fill="0F6B63"/>
           </w:tcPr>
           <w:p>
             <w:pPr>
@@ -492,7 +492,7 @@
         <w:tc>
           <w:tcPr>
             <w:tcW w:type="dxa" w:w="2551"/>
-            <w:shd w:val="clear" w:color="auto" w:fill="1F3864"/>
+            <w:shd w:val="clear" w:color="auto" w:fill="0F6B63"/>
           </w:tcPr>
           <w:p>
             <w:pPr>
@@ -572,7 +572,7 @@
           <w:tcPr>
             <w:tcW w:type="dxa" w:w="7087"/>
             <w:gridSpan w:val="2"/>
-            <w:shd w:val="clear" w:color="auto" w:fill="E8EDF5"/>
+            <w:shd w:val="clear" w:color="auto" w:fill="E3F1EF"/>
           </w:tcPr>
           <w:p>
             <w:pPr>
@@ -581,7 +581,7 @@
             <w:r>
               <w:rPr>
                 <w:b/>
-                <w:color w:val="1F3864"/>
+                <w:color w:val="0F6B63"/>
                 <w:sz w:val="22"/>
               </w:rPr>
               <w:t>TOTAL QUOTATION AMOUNT (inclusive of all applicable taxes)</w:t>
@@ -591,7 +591,7 @@
         <w:tc>
           <w:tcPr>
             <w:tcW w:type="dxa" w:w="2551"/>
-            <w:shd w:val="clear" w:color="auto" w:fill="E8EDF5"/>
+            <w:shd w:val="clear" w:color="auto" w:fill="E3F1EF"/>
           </w:tcPr>
           <w:p>
             <w:pPr>
@@ -601,7 +601,7 @@
             <w:r>
               <w:rPr>
                 <w:b/>
-                <w:color w:val="1F3864"/>
+                <w:color w:val="0F6B63"/>
                 <w:sz w:val="26"/>
               </w:rPr>
               <w:t>₹ 4,20,000</w:t>
@@ -626,13 +626,13 @@
         <w:keepNext/>
         <w:spacing w:after="80" w:before="200"/>
         <w:pBdr>
-          <w:bottom w:val="single" w:sz="6" w:color="1F3864" w:space="1"/>
+          <w:bottom w:val="single" w:sz="6" w:color="0F6B63" w:space="1"/>
         </w:pBdr>
       </w:pPr>
       <w:r>
         <w:rPr>
           <w:b/>
-          <w:color w:val="1F3864"/>
+          <w:color w:val="0F6B63"/>
           <w:sz w:val="22"/>
         </w:rPr>
         <w:t>3. PAYMENT TERMS</w:t>
@@ -643,12 +643,12 @@
         <w:tblW w:type="auto" w:w="0"/>
         <w:tblLook w:firstColumn="1" w:firstRow="1" w:lastColumn="0" w:lastRow="0" w:noHBand="0" w:noVBand="1" w:val="04A0"/>
         <w:tblBorders>
-          <w:top w:val="single" w:sz="4" w:color="9AA5B8"/>
-          <w:left w:val="single" w:sz="4" w:color="9AA5B8"/>
-          <w:bottom w:val="single" w:sz="4" w:color="9AA5B8"/>
-          <w:right w:val="single" w:sz="4" w:color="9AA5B8"/>
-          <w:insideH w:val="single" w:sz="4" w:color="9AA5B8"/>
-          <w:insideV w:val="single" w:sz="4" w:color="9AA5B8"/>
+          <w:top w:val="single" w:sz="4" w:color="8FB3AE"/>
+          <w:left w:val="single" w:sz="4" w:color="8FB3AE"/>
+          <w:bottom w:val="single" w:sz="4" w:color="8FB3AE"/>
+          <w:right w:val="single" w:sz="4" w:color="8FB3AE"/>
+          <w:insideH w:val="single" w:sz="4" w:color="8FB3AE"/>
+          <w:insideV w:val="single" w:sz="4" w:color="8FB3AE"/>
         </w:tblBorders>
         <w:tblLayout w:type="fixed"/>
         <w:tblCellMar>
@@ -673,7 +673,7 @@
         <w:tc>
           <w:tcPr>
             <w:tcW w:type="dxa" w:w="794"/>
-            <w:shd w:val="clear" w:color="auto" w:fill="1F3864"/>
+            <w:shd w:val="clear" w:color="auto" w:fill="0F6B63"/>
           </w:tcPr>
           <w:p>
             <w:pPr>
@@ -692,7 +692,7 @@
         <w:tc>
           <w:tcPr>
             <w:tcW w:type="dxa" w:w="4592"/>
-            <w:shd w:val="clear" w:color="auto" w:fill="1F3864"/>
+            <w:shd w:val="clear" w:color="auto" w:fill="0F6B63"/>
           </w:tcPr>
           <w:p>
             <w:pPr>
@@ -710,7 +710,7 @@
         <w:tc>
           <w:tcPr>
             <w:tcW w:type="dxa" w:w="2268"/>
-            <w:shd w:val="clear" w:color="auto" w:fill="1F3864"/>
+            <w:shd w:val="clear" w:color="auto" w:fill="0F6B63"/>
           </w:tcPr>
           <w:p>
             <w:pPr>
@@ -728,7 +728,7 @@
         <w:tc>
           <w:tcPr>
             <w:tcW w:type="dxa" w:w="1984"/>
-            <w:shd w:val="clear" w:color="auto" w:fill="1F3864"/>
+            <w:shd w:val="clear" w:color="auto" w:fill="0F6B63"/>
           </w:tcPr>
           <w:p>
             <w:pPr>
@@ -834,13 +834,13 @@
         <w:spacing w:after="80" w:before="200"/>
         <w:pageBreakBefore/>
         <w:pBdr>
-          <w:bottom w:val="single" w:sz="6" w:color="1F3864" w:space="1"/>
+          <w:bottom w:val="single" w:sz="6" w:color="0F6B63" w:space="1"/>
         </w:pBdr>
       </w:pPr>
       <w:r>
         <w:rPr>
           <w:b/>
-          <w:color w:val="1F3864"/>
+          <w:color w:val="0F6B63"/>
           <w:sz w:val="22"/>
         </w:rPr>
         <w:t>4. SERVICE CONDITIONS &amp; ASSUMPTIONS</w:t>
@@ -887,13 +887,13 @@
         <w:keepNext/>
         <w:spacing w:after="80" w:before="200"/>
         <w:pBdr>
-          <w:bottom w:val="single" w:sz="6" w:color="1F3864" w:space="1"/>
+          <w:bottom w:val="single" w:sz="6" w:color="0F6B63" w:space="1"/>
         </w:pBdr>
       </w:pPr>
       <w:r>
         <w:rPr>
           <w:b/>
-          <w:color w:val="1F3864"/>
+          <w:color w:val="0F6B63"/>
           <w:sz w:val="22"/>
         </w:rPr>
         <w:t>5. ACCEPTANCE</w:t>
@@ -915,12 +915,12 @@
         <w:tblW w:type="auto" w:w="0"/>
         <w:tblLook w:firstColumn="1" w:firstRow="1" w:lastColumn="0" w:lastRow="0" w:noHBand="0" w:noVBand="1" w:val="04A0"/>
         <w:tblBorders>
-          <w:top w:val="single" w:sz="4" w:color="9AA5B8"/>
-          <w:left w:val="single" w:sz="4" w:color="9AA5B8"/>
-          <w:bottom w:val="single" w:sz="4" w:color="9AA5B8"/>
-          <w:right w:val="single" w:sz="4" w:color="9AA5B8"/>
-          <w:insideH w:val="single" w:sz="4" w:color="9AA5B8"/>
-          <w:insideV w:val="single" w:sz="4" w:color="9AA5B8"/>
+          <w:top w:val="single" w:sz="4" w:color="8FB3AE"/>
+          <w:left w:val="single" w:sz="4" w:color="8FB3AE"/>
+          <w:bottom w:val="single" w:sz="4" w:color="8FB3AE"/>
+          <w:right w:val="single" w:sz="4" w:color="8FB3AE"/>
+          <w:insideH w:val="single" w:sz="4" w:color="8FB3AE"/>
+          <w:insideV w:val="single" w:sz="4" w:color="8FB3AE"/>
         </w:tblBorders>
         <w:tblLayout w:type="fixed"/>
         <w:tblCellMar>
@@ -942,7 +942,7 @@
         <w:tc>
           <w:tcPr>
             <w:tcW w:type="dxa" w:w="4819"/>
-            <w:shd w:val="clear" w:color="auto" w:fill="1F3864"/>
+            <w:shd w:val="clear" w:color="auto" w:fill="0F6B63"/>
           </w:tcPr>
           <w:p>
             <w:pPr>
@@ -960,7 +960,7 @@
         <w:tc>
           <w:tcPr>
             <w:tcW w:type="dxa" w:w="4819"/>
-            <w:shd w:val="clear" w:color="auto" w:fill="1F3864"/>
+            <w:shd w:val="clear" w:color="auto" w:fill="0F6B63"/>
           </w:tcPr>
           <w:p>
             <w:pPr>

</xml_diff>